<commit_message>
Examples for all types of cross validations
</commit_message>
<xml_diff>
--- a/machine_learning_basics/Cross-validation, Types of cross validation,Stratified K-Fold validation for classification model, Leave onout, P out cross validation.docx
+++ b/machine_learning_basics/Cross-validation, Types of cross validation,Stratified K-Fold validation for classification model, Leave onout, P out cross validation.docx
@@ -638,6 +638,9 @@
     </w:p>
     <w:p>
       <w:r>
+        <w:rPr>
+          <w:noProof/>
+        </w:rPr>
         <w:drawing>
           <wp:inline distT="0" distB="0" distL="0" distR="0" wp14:anchorId="73B32EBC" wp14:editId="3C14D71C">
             <wp:extent cx="5425910" cy="2453853"/>
@@ -719,6 +722,9 @@
     </w:p>
     <w:p>
       <w:r>
+        <w:rPr>
+          <w:noProof/>
+        </w:rPr>
         <w:drawing>
           <wp:inline distT="0" distB="0" distL="0" distR="0" wp14:anchorId="40B43976" wp14:editId="5D0D2F8B">
             <wp:extent cx="5303980" cy="2491956"/>
@@ -755,6 +761,227 @@
           </wp:inline>
         </w:drawing>
       </w:r>
+    </w:p>
+    <w:p/>
+    <w:p>
+      <w:pPr>
+        <w:rPr>
+          <w:b/>
+          <w:bCs/>
+          <w:sz w:val="28"/>
+          <w:szCs w:val="28"/>
+        </w:rPr>
+      </w:pPr>
+      <w:r>
+        <w:rPr>
+          <w:b/>
+          <w:bCs/>
+          <w:sz w:val="28"/>
+          <w:szCs w:val="28"/>
+        </w:rPr>
+        <w:t>EXAMPLE FOR K-FOLD CROSS VALIDATION</w:t>
+      </w:r>
+      <w:r>
+        <w:rPr>
+          <w:b/>
+          <w:bCs/>
+          <w:sz w:val="28"/>
+          <w:szCs w:val="28"/>
+        </w:rPr>
+        <w:t>, STRATIFIED CROSS VALIDATION</w:t>
+      </w:r>
+    </w:p>
+    <w:p>
+      <w:pPr>
+        <w:rPr>
+          <w:b/>
+          <w:bCs/>
+          <w:sz w:val="28"/>
+          <w:szCs w:val="28"/>
+        </w:rPr>
+      </w:pPr>
+      <w:r>
+        <w:rPr>
+          <w:b/>
+          <w:bCs/>
+          <w:sz w:val="28"/>
+          <w:szCs w:val="28"/>
+        </w:rPr>
+        <w:t xml:space="preserve">(code path: </w:t>
+      </w:r>
+      <w:r>
+        <w:rPr>
+          <w:b/>
+          <w:bCs/>
+          <w:sz w:val="28"/>
+          <w:szCs w:val="28"/>
+        </w:rPr>
+        <w:t>C:\Users\ADMIN\Documents\ML\Projects\Heart_disease_prediction\code.py</w:t>
+      </w:r>
+      <w:r>
+        <w:rPr>
+          <w:b/>
+          <w:bCs/>
+          <w:sz w:val="28"/>
+          <w:szCs w:val="28"/>
+        </w:rPr>
+        <w:t>)</w:t>
+      </w:r>
+    </w:p>
+    <w:p>
+      <w:r>
+        <w:t>In below example we got 10 accuracy results for 10 folds</w:t>
+      </w:r>
+    </w:p>
+    <w:p>
+      <w:r>
+        <w:lastRenderedPageBreak/>
+        <w:drawing>
+          <wp:inline distT="0" distB="0" distL="0" distR="0" wp14:anchorId="6FD36D1E" wp14:editId="2A096B99">
+            <wp:extent cx="3916680" cy="2032132"/>
+            <wp:effectExtent l="0" t="0" r="7620" b="6350"/>
+            <wp:docPr id="2067051133" name="Picture 1"/>
+            <wp:cNvGraphicFramePr>
+              <a:graphicFrameLocks xmlns:a="http://schemas.openxmlformats.org/drawingml/2006/main" noChangeAspect="1"/>
+            </wp:cNvGraphicFramePr>
+            <a:graphic xmlns:a="http://schemas.openxmlformats.org/drawingml/2006/main">
+              <a:graphicData uri="http://schemas.openxmlformats.org/drawingml/2006/picture">
+                <pic:pic xmlns:pic="http://schemas.openxmlformats.org/drawingml/2006/picture">
+                  <pic:nvPicPr>
+                    <pic:cNvPr id="2067051133" name=""/>
+                    <pic:cNvPicPr/>
+                  </pic:nvPicPr>
+                  <pic:blipFill>
+                    <a:blip r:embed="rId12"/>
+                    <a:stretch>
+                      <a:fillRect/>
+                    </a:stretch>
+                  </pic:blipFill>
+                  <pic:spPr>
+                    <a:xfrm>
+                      <a:off x="0" y="0"/>
+                      <a:ext cx="3930683" cy="2039397"/>
+                    </a:xfrm>
+                    <a:prstGeom prst="rect">
+                      <a:avLst/>
+                    </a:prstGeom>
+                  </pic:spPr>
+                </pic:pic>
+              </a:graphicData>
+            </a:graphic>
+          </wp:inline>
+        </w:drawing>
+      </w:r>
+      <w:r>
+        <w:t xml:space="preserve"> </w:t>
+      </w:r>
+    </w:p>
+    <w:p>
+      <w:r>
+        <w:drawing>
+          <wp:inline distT="0" distB="0" distL="0" distR="0" wp14:anchorId="748513E2" wp14:editId="7505307A">
+            <wp:extent cx="3802380" cy="1824734"/>
+            <wp:effectExtent l="0" t="0" r="7620" b="4445"/>
+            <wp:docPr id="1098024043" name="Picture 1"/>
+            <wp:cNvGraphicFramePr>
+              <a:graphicFrameLocks xmlns:a="http://schemas.openxmlformats.org/drawingml/2006/main" noChangeAspect="1"/>
+            </wp:cNvGraphicFramePr>
+            <a:graphic xmlns:a="http://schemas.openxmlformats.org/drawingml/2006/main">
+              <a:graphicData uri="http://schemas.openxmlformats.org/drawingml/2006/picture">
+                <pic:pic xmlns:pic="http://schemas.openxmlformats.org/drawingml/2006/picture">
+                  <pic:nvPicPr>
+                    <pic:cNvPr id="1098024043" name=""/>
+                    <pic:cNvPicPr/>
+                  </pic:nvPicPr>
+                  <pic:blipFill>
+                    <a:blip r:embed="rId13"/>
+                    <a:stretch>
+                      <a:fillRect/>
+                    </a:stretch>
+                  </pic:blipFill>
+                  <pic:spPr>
+                    <a:xfrm>
+                      <a:off x="0" y="0"/>
+                      <a:ext cx="3809933" cy="1828359"/>
+                    </a:xfrm>
+                    <a:prstGeom prst="rect">
+                      <a:avLst/>
+                    </a:prstGeom>
+                  </pic:spPr>
+                </pic:pic>
+              </a:graphicData>
+            </a:graphic>
+          </wp:inline>
+        </w:drawing>
+      </w:r>
+    </w:p>
+    <w:p/>
+    <w:p>
+      <w:pPr>
+        <w:rPr>
+          <w:b/>
+          <w:bCs/>
+        </w:rPr>
+      </w:pPr>
+      <w:r>
+        <w:rPr>
+          <w:b/>
+          <w:bCs/>
+        </w:rPr>
+        <w:t>EXAMPLE FOR LEAVE ONE OUT</w:t>
+      </w:r>
+    </w:p>
+    <w:p>
+      <w:r>
+        <w:t>Below code data set have 270 records, so this validation executed 270 time, each time it takes only one data for test, it will prediction results as 0 or 1. 0 means wrong prediction, 1 means correct prediction.</w:t>
+      </w:r>
+    </w:p>
+    <w:p>
+      <w:r>
+        <w:drawing>
+          <wp:inline distT="0" distB="0" distL="0" distR="0" wp14:anchorId="1538B4F4" wp14:editId="09EF3E29">
+            <wp:extent cx="3383280" cy="3024161"/>
+            <wp:effectExtent l="0" t="0" r="7620" b="5080"/>
+            <wp:docPr id="1484961176" name="Picture 1"/>
+            <wp:cNvGraphicFramePr>
+              <a:graphicFrameLocks xmlns:a="http://schemas.openxmlformats.org/drawingml/2006/main" noChangeAspect="1"/>
+            </wp:cNvGraphicFramePr>
+            <a:graphic xmlns:a="http://schemas.openxmlformats.org/drawingml/2006/main">
+              <a:graphicData uri="http://schemas.openxmlformats.org/drawingml/2006/picture">
+                <pic:pic xmlns:pic="http://schemas.openxmlformats.org/drawingml/2006/picture">
+                  <pic:nvPicPr>
+                    <pic:cNvPr id="1484961176" name=""/>
+                    <pic:cNvPicPr/>
+                  </pic:nvPicPr>
+                  <pic:blipFill>
+                    <a:blip r:embed="rId14"/>
+                    <a:stretch>
+                      <a:fillRect/>
+                    </a:stretch>
+                  </pic:blipFill>
+                  <pic:spPr>
+                    <a:xfrm>
+                      <a:off x="0" y="0"/>
+                      <a:ext cx="3386408" cy="3026957"/>
+                    </a:xfrm>
+                    <a:prstGeom prst="rect">
+                      <a:avLst/>
+                    </a:prstGeom>
+                  </pic:spPr>
+                </pic:pic>
+              </a:graphicData>
+            </a:graphic>
+          </wp:inline>
+        </w:drawing>
+      </w:r>
+    </w:p>
+    <w:p>
+      <w:pPr>
+        <w:rPr>
+          <w:b/>
+          <w:bCs/>
+        </w:rPr>
+      </w:pPr>
     </w:p>
     <w:p/>
     <w:sectPr>

</xml_diff>